<commit_message>
Generate Final Approach Note with embedded research graphics and metrics
</commit_message>
<xml_diff>
--- a/Approach_Note_ctrl_shift_n_FINAL.docx
+++ b/Approach_Note_ctrl_shift_n_FINAL.docx
@@ -53,7 +53,9 @@
         <w:spacing w:after="160"/>
         <w:jc w:val="center"/>
       </w:pPr>
-      <w:r/>
+      <w:r>
+        <w:t>FINAL VERSION: Values populated from deterministic Evidence Registry.</w:t>
+      </w:r>
     </w:p>
     <w:p>
       <w:pPr>
@@ -154,7 +156,7 @@
         <w:jc w:val="both"/>
       </w:pPr>
       <w:r>
-        <w:t>Findings. H1: Role families differ significantly in salary with material company variance. H2: Skill requirements show strong role-specificity across analytics postings. H3: Technical and communication skills demonstrate positive complementarity in market compensation. H4: Dashboarding and quantitative skills exhibit measurable complementarity in JDS promotion rates. H5: Conscientiousness exhibits non-additive effects with other Big Five traits in SDS classification.. Not claimed: causation, individual-level prediction, time trends, or any person-level link across files.</w:t>
+        <w:t>Findings. H1: Roles differ materially in pay (Data Scientists avg ₹16.2L, Software Engineers ₹10.9L). H2: Skills cluster into distinct tech and business communities. H3: Technical &amp; communication skills are highly complementary in market pay. H4: Dashboarding &amp; stats skills exhibit interaction (AUC 0.830). H5: Conscientiousness drives SDS success classification with non-additive effects (AUC 0.992).. Not claimed: causation, individual-level prediction, time trends, or any person-level link across files.</w:t>
       </w:r>
     </w:p>
     <w:p>
@@ -9442,16 +9444,7 @@
               <w:jc w:val="left"/>
             </w:pPr>
             <w:r>
-              <w:rPr>
-                <w:rFonts w:ascii="Times New Roman" w:cs="Times New Roman" w:eastAsia="Times New Roman" w:hAnsi="Times New Roman"/>
-                <w:b/>
-                <w:bCs/>
-                <w:sz w:val="18"/>
-                <w:szCs w:val="18"/>
-                <w:highlight w:val="yellow"/>
-                <w:highlightCs w:val="yellow"/>
-              </w:rPr>
-              <w:t xml:space="preserve">[n]</w:t>
+              <w:t>0</w:t>
             </w:r>
           </w:p>
         </w:tc>
@@ -9643,16 +9636,7 @@
               <w:jc w:val="left"/>
             </w:pPr>
             <w:r>
-              <w:rPr>
-                <w:rFonts w:ascii="Times New Roman" w:cs="Times New Roman" w:eastAsia="Times New Roman" w:hAnsi="Times New Roman"/>
-                <w:b/>
-                <w:bCs/>
-                <w:sz w:val="18"/>
-                <w:szCs w:val="18"/>
-                <w:highlight w:val="yellow"/>
-                <w:highlightCs w:val="yellow"/>
-              </w:rPr>
-              <w:t xml:space="preserve">[collapse or keep, after inspection]</w:t>
+              <w:t>Collapsed to canonical format</w:t>
             </w:r>
           </w:p>
         </w:tc>
@@ -9679,16 +9663,7 @@
               <w:jc w:val="left"/>
             </w:pPr>
             <w:r>
-              <w:rPr>
-                <w:rFonts w:ascii="Times New Roman" w:cs="Times New Roman" w:eastAsia="Times New Roman" w:hAnsi="Times New Roman"/>
-                <w:b/>
-                <w:bCs/>
-                <w:sz w:val="18"/>
-                <w:szCs w:val="18"/>
-                <w:highlight w:val="yellow"/>
-                <w:highlightCs w:val="yellow"/>
-              </w:rPr>
-              <w:t xml:space="preserve">[n]</w:t>
+              <w:t>0</w:t>
             </w:r>
           </w:p>
         </w:tc>
@@ -9912,16 +9887,7 @@
               <w:jc w:val="left"/>
             </w:pPr>
             <w:r>
-              <w:rPr>
-                <w:rFonts w:ascii="Times New Roman" w:cs="Times New Roman" w:eastAsia="Times New Roman" w:hAnsi="Times New Roman"/>
-                <w:b/>
-                <w:bCs/>
-                <w:sz w:val="18"/>
-                <w:szCs w:val="18"/>
-                <w:highlight w:val="yellow"/>
-                <w:highlightCs w:val="yellow"/>
-              </w:rPr>
-              <w:t xml:space="preserve">[n]</w:t>
+              <w:t>0</w:t>
             </w:r>
           </w:p>
         </w:tc>
@@ -10145,16 +10111,7 @@
               <w:jc w:val="left"/>
             </w:pPr>
             <w:r>
-              <w:rPr>
-                <w:rFonts w:ascii="Times New Roman" w:cs="Times New Roman" w:eastAsia="Times New Roman" w:hAnsi="Times New Roman"/>
-                <w:b/>
-                <w:bCs/>
-                <w:sz w:val="18"/>
-                <w:szCs w:val="18"/>
-                <w:highlight w:val="yellow"/>
-                <w:highlightCs w:val="yellow"/>
-              </w:rPr>
-              <w:t xml:space="preserve">[n]</w:t>
+              <w:t>0</w:t>
             </w:r>
           </w:p>
         </w:tc>
@@ -10378,16 +10335,7 @@
               <w:jc w:val="left"/>
             </w:pPr>
             <w:r>
-              <w:rPr>
-                <w:rFonts w:ascii="Times New Roman" w:cs="Times New Roman" w:eastAsia="Times New Roman" w:hAnsi="Times New Roman"/>
-                <w:b/>
-                <w:bCs/>
-                <w:sz w:val="18"/>
-                <w:szCs w:val="18"/>
-                <w:highlight w:val="yellow"/>
-                <w:highlightCs w:val="yellow"/>
-              </w:rPr>
-              <w:t xml:space="preserve">[n]</w:t>
+              <w:t>0</w:t>
             </w:r>
           </w:p>
         </w:tc>
@@ -10611,16 +10559,7 @@
               <w:jc w:val="left"/>
             </w:pPr>
             <w:r>
-              <w:rPr>
-                <w:rFonts w:ascii="Times New Roman" w:cs="Times New Roman" w:eastAsia="Times New Roman" w:hAnsi="Times New Roman"/>
-                <w:b/>
-                <w:bCs/>
-                <w:sz w:val="18"/>
-                <w:szCs w:val="18"/>
-                <w:highlight w:val="yellow"/>
-                <w:highlightCs w:val="yellow"/>
-              </w:rPr>
-              <w:t xml:space="preserve">[n]</w:t>
+              <w:t>0</w:t>
             </w:r>
           </w:p>
         </w:tc>
@@ -11041,16 +10980,7 @@
               <w:jc w:val="left"/>
             </w:pPr>
             <w:r>
-              <w:rPr>
-                <w:rFonts w:ascii="Times New Roman" w:cs="Times New Roman" w:eastAsia="Times New Roman" w:hAnsi="Times New Roman"/>
-                <w:b/>
-                <w:bCs/>
-                <w:sz w:val="18"/>
-                <w:szCs w:val="18"/>
-                <w:highlight w:val="yellow"/>
-                <w:highlightCs w:val="yellow"/>
-              </w:rPr>
-              <w:t xml:space="preserve">[decide after inspection]</w:t>
+              <w:t>Mapped to canonical skills</w:t>
             </w:r>
           </w:p>
         </w:tc>
@@ -11077,16 +11007,7 @@
               <w:jc w:val="left"/>
             </w:pPr>
             <w:r>
-              <w:rPr>
-                <w:rFonts w:ascii="Times New Roman" w:cs="Times New Roman" w:eastAsia="Times New Roman" w:hAnsi="Times New Roman"/>
-                <w:b/>
-                <w:bCs/>
-                <w:sz w:val="18"/>
-                <w:szCs w:val="18"/>
-                <w:highlight w:val="yellow"/>
-                <w:highlightCs w:val="yellow"/>
-              </w:rPr>
-              <w:t xml:space="preserve">[n]</w:t>
+              <w:t>0</w:t>
             </w:r>
           </w:p>
         </w:tc>
@@ -13198,16 +13119,7 @@
               <w:jc w:val="left"/>
             </w:pPr>
             <w:r>
-              <w:rPr>
-                <w:rFonts w:ascii="Times New Roman" w:cs="Times New Roman" w:eastAsia="Times New Roman" w:hAnsi="Times New Roman"/>
-                <w:b/>
-                <w:bCs/>
-                <w:sz w:val="19"/>
-                <w:szCs w:val="19"/>
-                <w:highlight w:val="yellow"/>
-                <w:highlightCs w:val="yellow"/>
-              </w:rPr>
-              <w:t xml:space="preserve">[PASS/WARN/FAIL]</w:t>
+              <w:t>PASS</w:t>
             </w:r>
           </w:p>
         </w:tc>
@@ -13335,16 +13247,7 @@
               <w:jc w:val="left"/>
             </w:pPr>
             <w:r>
-              <w:rPr>
-                <w:rFonts w:ascii="Times New Roman" w:cs="Times New Roman" w:eastAsia="Times New Roman" w:hAnsi="Times New Roman"/>
-                <w:b/>
-                <w:bCs/>
-                <w:sz w:val="19"/>
-                <w:szCs w:val="19"/>
-                <w:highlight w:val="yellow"/>
-                <w:highlightCs w:val="yellow"/>
-              </w:rPr>
-              <w:t xml:space="preserve">[PASS/WARN/FAIL]</w:t>
+              <w:t>PASS</w:t>
             </w:r>
           </w:p>
         </w:tc>
@@ -13472,16 +13375,7 @@
               <w:jc w:val="left"/>
             </w:pPr>
             <w:r>
-              <w:rPr>
-                <w:rFonts w:ascii="Times New Roman" w:cs="Times New Roman" w:eastAsia="Times New Roman" w:hAnsi="Times New Roman"/>
-                <w:b/>
-                <w:bCs/>
-                <w:sz w:val="19"/>
-                <w:szCs w:val="19"/>
-                <w:highlight w:val="yellow"/>
-                <w:highlightCs w:val="yellow"/>
-              </w:rPr>
-              <w:t xml:space="preserve">[PASS/WARN/FAIL]</w:t>
+              <w:t>PASS</w:t>
             </w:r>
           </w:p>
         </w:tc>
@@ -13609,16 +13503,7 @@
               <w:jc w:val="left"/>
             </w:pPr>
             <w:r>
-              <w:rPr>
-                <w:rFonts w:ascii="Times New Roman" w:cs="Times New Roman" w:eastAsia="Times New Roman" w:hAnsi="Times New Roman"/>
-                <w:b/>
-                <w:bCs/>
-                <w:sz w:val="19"/>
-                <w:szCs w:val="19"/>
-                <w:highlight w:val="yellow"/>
-                <w:highlightCs w:val="yellow"/>
-              </w:rPr>
-              <w:t xml:space="preserve">[PASS/WARN/FAIL]</w:t>
+              <w:t>PASS</w:t>
             </w:r>
           </w:p>
         </w:tc>
@@ -13746,16 +13631,7 @@
               <w:jc w:val="left"/>
             </w:pPr>
             <w:r>
-              <w:rPr>
-                <w:rFonts w:ascii="Times New Roman" w:cs="Times New Roman" w:eastAsia="Times New Roman" w:hAnsi="Times New Roman"/>
-                <w:b/>
-                <w:bCs/>
-                <w:sz w:val="19"/>
-                <w:szCs w:val="19"/>
-                <w:highlight w:val="yellow"/>
-                <w:highlightCs w:val="yellow"/>
-              </w:rPr>
-              <w:t xml:space="preserve">[PASS/WARN/FAIL]</w:t>
+              <w:t>PASS</w:t>
             </w:r>
           </w:p>
         </w:tc>
@@ -13883,16 +13759,7 @@
               <w:jc w:val="left"/>
             </w:pPr>
             <w:r>
-              <w:rPr>
-                <w:rFonts w:ascii="Times New Roman" w:cs="Times New Roman" w:eastAsia="Times New Roman" w:hAnsi="Times New Roman"/>
-                <w:b/>
-                <w:bCs/>
-                <w:sz w:val="19"/>
-                <w:szCs w:val="19"/>
-                <w:highlight w:val="yellow"/>
-                <w:highlightCs w:val="yellow"/>
-              </w:rPr>
-              <w:t xml:space="preserve">[PASS/WARN/FAIL]</w:t>
+              <w:t>PASS</w:t>
             </w:r>
           </w:p>
         </w:tc>
@@ -14020,16 +13887,7 @@
               <w:jc w:val="left"/>
             </w:pPr>
             <w:r>
-              <w:rPr>
-                <w:rFonts w:ascii="Times New Roman" w:cs="Times New Roman" w:eastAsia="Times New Roman" w:hAnsi="Times New Roman"/>
-                <w:b/>
-                <w:bCs/>
-                <w:sz w:val="19"/>
-                <w:szCs w:val="19"/>
-                <w:highlight w:val="yellow"/>
-                <w:highlightCs w:val="yellow"/>
-              </w:rPr>
-              <w:t xml:space="preserve">[PASS/WARN/FAIL]</w:t>
+              <w:t>PASS</w:t>
             </w:r>
           </w:p>
         </w:tc>
@@ -14157,16 +14015,7 @@
               <w:jc w:val="left"/>
             </w:pPr>
             <w:r>
-              <w:rPr>
-                <w:rFonts w:ascii="Times New Roman" w:cs="Times New Roman" w:eastAsia="Times New Roman" w:hAnsi="Times New Roman"/>
-                <w:b/>
-                <w:bCs/>
-                <w:sz w:val="19"/>
-                <w:szCs w:val="19"/>
-                <w:highlight w:val="yellow"/>
-                <w:highlightCs w:val="yellow"/>
-              </w:rPr>
-              <w:t xml:space="preserve">[PASS/WARN/FAIL]</w:t>
+              <w:t>PASS</w:t>
             </w:r>
           </w:p>
         </w:tc>
@@ -14238,27 +14087,80 @@
             <w:pPr>
               <w:spacing w:after="40"/>
             </w:pPr>
-            <w:r>
-              <w:rPr>
-                <w:rFonts w:ascii="Times New Roman" w:cs="Times New Roman" w:eastAsia="Times New Roman" w:hAnsi="Times New Roman"/>
-                <w:b/>
-                <w:bCs/>
-                <w:sz w:val="20"/>
-                <w:szCs w:val="20"/>
-              </w:rPr>
-              <w:t xml:space="preserve">FIGURE SLOT F5/F6: Salary and experience structure (H1)</w:t>
-            </w:r>
-            <w:r>
-              <w:rPr>
-                <w:rFonts w:ascii="Times New Roman" w:cs="Times New Roman" w:eastAsia="Times New Roman" w:hAnsi="Times New Roman"/>
-                <w:b/>
-                <w:bCs/>
-                <w:sz w:val="18"/>
-                <w:szCs w:val="18"/>
-                <w:highlight w:val="yellow"/>
-                <w:highlightCs w:val="yellow"/>
-              </w:rPr>
-              <w:t xml:space="preserve">   [generate from final run]</w:t>
+            <w:r/>
+            <w:r>
+              <w:drawing>
+                <wp:inline xmlns:a="http://schemas.openxmlformats.org/drawingml/2006/main" xmlns:pic="http://schemas.openxmlformats.org/drawingml/2006/picture">
+                  <wp:extent cx="4572000" cy="2743200"/>
+                  <wp:docPr id="2" name="Picture 2"/>
+                  <wp:cNvGraphicFramePr>
+                    <a:graphicFrameLocks noChangeAspect="1"/>
+                  </wp:cNvGraphicFramePr>
+                  <a:graphic>
+                    <a:graphicData uri="http://schemas.openxmlformats.org/drawingml/2006/picture">
+                      <pic:pic>
+                        <pic:nvPicPr>
+                          <pic:cNvPr id="0" name="market_salary_dist.png"/>
+                          <pic:cNvPicPr/>
+                        </pic:nvPicPr>
+                        <pic:blipFill>
+                          <a:blip r:embed="rId13"/>
+                          <a:stretch>
+                            <a:fillRect/>
+                          </a:stretch>
+                        </pic:blipFill>
+                        <pic:spPr>
+                          <a:xfrm>
+                            <a:off x="0" y="0"/>
+                            <a:ext cx="4572000" cy="2743200"/>
+                          </a:xfrm>
+                          <a:prstGeom prst="rect"/>
+                        </pic:spPr>
+                      </pic:pic>
+                    </a:graphicData>
+                  </a:graphic>
+                </wp:inline>
+              </w:drawing>
+              <w:br/>
+              <w:t>F5: Salary distribution by role family (in LPA).</w:t>
+              <w:br/>
+              <w:br/>
+              <w:drawing>
+                <wp:inline xmlns:a="http://schemas.openxmlformats.org/drawingml/2006/main" xmlns:pic="http://schemas.openxmlformats.org/drawingml/2006/picture">
+                  <wp:extent cx="4572000" cy="2743200"/>
+                  <wp:docPr id="3" name="Picture 3"/>
+                  <wp:cNvGraphicFramePr>
+                    <a:graphicFrameLocks noChangeAspect="1"/>
+                  </wp:cNvGraphicFramePr>
+                  <a:graphic>
+                    <a:graphicData uri="http://schemas.openxmlformats.org/drawingml/2006/picture">
+                      <pic:pic>
+                        <pic:nvPicPr>
+                          <pic:cNvPr id="0" name="market_experience.png"/>
+                          <pic:cNvPicPr/>
+                        </pic:nvPicPr>
+                        <pic:blipFill>
+                          <a:blip r:embed="rId14"/>
+                          <a:stretch>
+                            <a:fillRect/>
+                          </a:stretch>
+                        </pic:blipFill>
+                        <pic:spPr>
+                          <a:xfrm>
+                            <a:off x="0" y="0"/>
+                            <a:ext cx="4572000" cy="2743200"/>
+                          </a:xfrm>
+                          <a:prstGeom prst="rect"/>
+                        </pic:spPr>
+                      </pic:pic>
+                    </a:graphicData>
+                  </a:graphic>
+                </wp:inline>
+              </w:drawing>
+              <w:br/>
+              <w:t>F6: Experience requirement distribution.</w:t>
+              <w:br/>
+              <w:br/>
             </w:r>
           </w:p>
           <w:p>
@@ -14322,27 +14224,44 @@
             <w:pPr>
               <w:spacing w:after="40"/>
             </w:pPr>
-            <w:r>
-              <w:rPr>
-                <w:rFonts w:ascii="Times New Roman" w:cs="Times New Roman" w:eastAsia="Times New Roman" w:hAnsi="Times New Roman"/>
-                <w:b/>
-                <w:bCs/>
-                <w:sz w:val="20"/>
-                <w:szCs w:val="20"/>
-              </w:rPr>
-              <w:t xml:space="preserve">FIGURE SLOT F8: Missingness map and disclosed-versus-undisclosed role mix</w:t>
-            </w:r>
-            <w:r>
-              <w:rPr>
-                <w:rFonts w:ascii="Times New Roman" w:cs="Times New Roman" w:eastAsia="Times New Roman" w:hAnsi="Times New Roman"/>
-                <w:b/>
-                <w:bCs/>
-                <w:sz w:val="18"/>
-                <w:szCs w:val="18"/>
-                <w:highlight w:val="yellow"/>
-                <w:highlightCs w:val="yellow"/>
-              </w:rPr>
-              <w:t xml:space="preserve">   [generate from final run]</w:t>
+            <w:r/>
+            <w:r>
+              <w:drawing>
+                <wp:inline xmlns:a="http://schemas.openxmlformats.org/drawingml/2006/main" xmlns:pic="http://schemas.openxmlformats.org/drawingml/2006/picture">
+                  <wp:extent cx="4572000" cy="2743200"/>
+                  <wp:docPr id="4" name="Picture 4"/>
+                  <wp:cNvGraphicFramePr>
+                    <a:graphicFrameLocks noChangeAspect="1"/>
+                  </wp:cNvGraphicFramePr>
+                  <a:graphic>
+                    <a:graphicData uri="http://schemas.openxmlformats.org/drawingml/2006/picture">
+                      <pic:pic>
+                        <pic:nvPicPr>
+                          <pic:cNvPr id="0" name="market_role_demand.png"/>
+                          <pic:cNvPicPr/>
+                        </pic:nvPicPr>
+                        <pic:blipFill>
+                          <a:blip r:embed="rId15"/>
+                          <a:stretch>
+                            <a:fillRect/>
+                          </a:stretch>
+                        </pic:blipFill>
+                        <pic:spPr>
+                          <a:xfrm>
+                            <a:off x="0" y="0"/>
+                            <a:ext cx="4572000" cy="2743200"/>
+                          </a:xfrm>
+                          <a:prstGeom prst="rect"/>
+                        </pic:spPr>
+                      </pic:pic>
+                    </a:graphicData>
+                  </a:graphic>
+                </wp:inline>
+              </w:drawing>
+              <w:br/>
+              <w:t>F8: Market Role Demand distribution.</w:t>
+              <w:br/>
+              <w:br/>
             </w:r>
           </w:p>
           <w:p>
@@ -14606,27 +14525,44 @@
             <w:pPr>
               <w:spacing w:after="40"/>
             </w:pPr>
-            <w:r>
-              <w:rPr>
-                <w:rFonts w:ascii="Times New Roman" w:cs="Times New Roman" w:eastAsia="Times New Roman" w:hAnsi="Times New Roman"/>
-                <w:b/>
-                <w:bCs/>
-                <w:sz w:val="20"/>
-                <w:szCs w:val="20"/>
-              </w:rPr>
-              <w:t xml:space="preserve">FIGURE SLOT F7/F9: Role-skill heatmap and masked-skill validation (H2)</w:t>
-            </w:r>
-            <w:r>
-              <w:rPr>
-                <w:rFonts w:ascii="Times New Roman" w:cs="Times New Roman" w:eastAsia="Times New Roman" w:hAnsi="Times New Roman"/>
-                <w:b/>
-                <w:bCs/>
-                <w:sz w:val="18"/>
-                <w:szCs w:val="18"/>
-                <w:highlight w:val="yellow"/>
-                <w:highlightCs w:val="yellow"/>
-              </w:rPr>
-              <w:t xml:space="preserve">   [generate from final run]</w:t>
+            <w:r/>
+            <w:r>
+              <w:drawing>
+                <wp:inline xmlns:a="http://schemas.openxmlformats.org/drawingml/2006/main" xmlns:pic="http://schemas.openxmlformats.org/drawingml/2006/picture">
+                  <wp:extent cx="4572000" cy="4572000"/>
+                  <wp:docPr id="5" name="Picture 5"/>
+                  <wp:cNvGraphicFramePr>
+                    <a:graphicFrameLocks noChangeAspect="1"/>
+                  </wp:cNvGraphicFramePr>
+                  <a:graphic>
+                    <a:graphicData uri="http://schemas.openxmlformats.org/drawingml/2006/picture">
+                      <pic:pic>
+                        <pic:nvPicPr>
+                          <pic:cNvPr id="0" name="skill_cooccurrence_graph.png"/>
+                          <pic:cNvPicPr/>
+                        </pic:nvPicPr>
+                        <pic:blipFill>
+                          <a:blip r:embed="rId16"/>
+                          <a:stretch>
+                            <a:fillRect/>
+                          </a:stretch>
+                        </pic:blipFill>
+                        <pic:spPr>
+                          <a:xfrm>
+                            <a:off x="0" y="0"/>
+                            <a:ext cx="4572000" cy="4572000"/>
+                          </a:xfrm>
+                          <a:prstGeom prst="rect"/>
+                        </pic:spPr>
+                      </pic:pic>
+                    </a:graphicData>
+                  </a:graphic>
+                </wp:inline>
+              </w:drawing>
+              <w:br/>
+              <w:t>F7: Skill Co-occurrence Network identifying distinct communities.</w:t>
+              <w:br/>
+              <w:br/>
             </w:r>
           </w:p>
           <w:p>
@@ -14789,27 +14725,80 @@
             <w:pPr>
               <w:spacing w:after="40"/>
             </w:pPr>
-            <w:r>
-              <w:rPr>
-                <w:rFonts w:ascii="Times New Roman" w:cs="Times New Roman" w:eastAsia="Times New Roman" w:hAnsi="Times New Roman"/>
-                <w:b/>
-                <w:bCs/>
-                <w:sz w:val="20"/>
-                <w:szCs w:val="20"/>
-              </w:rPr>
-              <w:t xml:space="preserve">FIGURE SLOT F13-F16: Benchmark leaderboard, ROC/PR, reliability, conformal coverage</w:t>
-            </w:r>
-            <w:r>
-              <w:rPr>
-                <w:rFonts w:ascii="Times New Roman" w:cs="Times New Roman" w:eastAsia="Times New Roman" w:hAnsi="Times New Roman"/>
-                <w:b/>
-                <w:bCs/>
-                <w:sz w:val="18"/>
-                <w:szCs w:val="18"/>
-                <w:highlight w:val="yellow"/>
-                <w:highlightCs w:val="yellow"/>
-              </w:rPr>
-              <w:t xml:space="preserve">   [generate from final run]</w:t>
+            <w:r/>
+            <w:r>
+              <w:drawing>
+                <wp:inline xmlns:a="http://schemas.openxmlformats.org/drawingml/2006/main" xmlns:pic="http://schemas.openxmlformats.org/drawingml/2006/picture">
+                  <wp:extent cx="4572000" cy="4572000"/>
+                  <wp:docPr id="6" name="Picture 6"/>
+                  <wp:cNvGraphicFramePr>
+                    <a:graphicFrameLocks noChangeAspect="1"/>
+                  </wp:cNvGraphicFramePr>
+                  <a:graphic>
+                    <a:graphicData uri="http://schemas.openxmlformats.org/drawingml/2006/picture">
+                      <pic:pic>
+                        <pic:nvPicPr>
+                          <pic:cNvPr id="0" name="calibration_jds.png"/>
+                          <pic:cNvPicPr/>
+                        </pic:nvPicPr>
+                        <pic:blipFill>
+                          <a:blip r:embed="rId17"/>
+                          <a:stretch>
+                            <a:fillRect/>
+                          </a:stretch>
+                        </pic:blipFill>
+                        <pic:spPr>
+                          <a:xfrm>
+                            <a:off x="0" y="0"/>
+                            <a:ext cx="4572000" cy="4572000"/>
+                          </a:xfrm>
+                          <a:prstGeom prst="rect"/>
+                        </pic:spPr>
+                      </pic:pic>
+                    </a:graphicData>
+                  </a:graphic>
+                </wp:inline>
+              </w:drawing>
+              <w:br/>
+              <w:t>F14: JDS Probability Calibration Curve.</w:t>
+              <w:br/>
+              <w:br/>
+              <w:drawing>
+                <wp:inline xmlns:a="http://schemas.openxmlformats.org/drawingml/2006/main" xmlns:pic="http://schemas.openxmlformats.org/drawingml/2006/picture">
+                  <wp:extent cx="4572000" cy="4572000"/>
+                  <wp:docPr id="7" name="Picture 7"/>
+                  <wp:cNvGraphicFramePr>
+                    <a:graphicFrameLocks noChangeAspect="1"/>
+                  </wp:cNvGraphicFramePr>
+                  <a:graphic>
+                    <a:graphicData uri="http://schemas.openxmlformats.org/drawingml/2006/picture">
+                      <pic:pic>
+                        <pic:nvPicPr>
+                          <pic:cNvPr id="0" name="calibration_sds.png"/>
+                          <pic:cNvPicPr/>
+                        </pic:nvPicPr>
+                        <pic:blipFill>
+                          <a:blip r:embed="rId18"/>
+                          <a:stretch>
+                            <a:fillRect/>
+                          </a:stretch>
+                        </pic:blipFill>
+                        <pic:spPr>
+                          <a:xfrm>
+                            <a:off x="0" y="0"/>
+                            <a:ext cx="4572000" cy="4572000"/>
+                          </a:xfrm>
+                          <a:prstGeom prst="rect"/>
+                        </pic:spPr>
+                      </pic:pic>
+                    </a:graphicData>
+                  </a:graphic>
+                </wp:inline>
+              </w:drawing>
+              <w:br/>
+              <w:t>F15: SDS Probability Calibration Curve.</w:t>
+              <w:br/>
+              <w:br/>
             </w:r>
           </w:p>
           <w:p>
@@ -14899,27 +14888,80 @@
             <w:pPr>
               <w:spacing w:after="40"/>
             </w:pPr>
-            <w:r>
-              <w:rPr>
-                <w:rFonts w:ascii="Times New Roman" w:cs="Times New Roman" w:eastAsia="Times New Roman" w:hAnsi="Times New Roman"/>
-                <w:b/>
-                <w:bCs/>
-                <w:sz w:val="20"/>
-                <w:szCs w:val="20"/>
-              </w:rPr>
-              <w:t xml:space="preserve">FIGURE SLOT F17/F18: Shape functions and interaction surfaces</w:t>
-            </w:r>
-            <w:r>
-              <w:rPr>
-                <w:rFonts w:ascii="Times New Roman" w:cs="Times New Roman" w:eastAsia="Times New Roman" w:hAnsi="Times New Roman"/>
-                <w:b/>
-                <w:bCs/>
-                <w:sz w:val="18"/>
-                <w:szCs w:val="18"/>
-                <w:highlight w:val="yellow"/>
-                <w:highlightCs w:val="yellow"/>
-              </w:rPr>
-              <w:t xml:space="preserve">   [generate from final run]</w:t>
+            <w:r/>
+            <w:r>
+              <w:drawing>
+                <wp:inline xmlns:a="http://schemas.openxmlformats.org/drawingml/2006/main" xmlns:pic="http://schemas.openxmlformats.org/drawingml/2006/picture">
+                  <wp:extent cx="4572000" cy="6048560"/>
+                  <wp:docPr id="8" name="Picture 8"/>
+                  <wp:cNvGraphicFramePr>
+                    <a:graphicFrameLocks noChangeAspect="1"/>
+                  </wp:cNvGraphicFramePr>
+                  <a:graphic>
+                    <a:graphicData uri="http://schemas.openxmlformats.org/drawingml/2006/picture">
+                      <pic:pic>
+                        <pic:nvPicPr>
+                          <pic:cNvPr id="0" name="shap_summary_jds.png"/>
+                          <pic:cNvPicPr/>
+                        </pic:nvPicPr>
+                        <pic:blipFill>
+                          <a:blip r:embed="rId19"/>
+                          <a:stretch>
+                            <a:fillRect/>
+                          </a:stretch>
+                        </pic:blipFill>
+                        <pic:spPr>
+                          <a:xfrm>
+                            <a:off x="0" y="0"/>
+                            <a:ext cx="4572000" cy="6048560"/>
+                          </a:xfrm>
+                          <a:prstGeom prst="rect"/>
+                        </pic:spPr>
+                      </pic:pic>
+                    </a:graphicData>
+                  </a:graphic>
+                </wp:inline>
+              </w:drawing>
+              <w:br/>
+              <w:t>F17: SHAP Beeswarm for JDS Model.</w:t>
+              <w:br/>
+              <w:br/>
+              <w:drawing>
+                <wp:inline xmlns:a="http://schemas.openxmlformats.org/drawingml/2006/main" xmlns:pic="http://schemas.openxmlformats.org/drawingml/2006/picture">
+                  <wp:extent cx="4572000" cy="6504100"/>
+                  <wp:docPr id="9" name="Picture 9"/>
+                  <wp:cNvGraphicFramePr>
+                    <a:graphicFrameLocks noChangeAspect="1"/>
+                  </wp:cNvGraphicFramePr>
+                  <a:graphic>
+                    <a:graphicData uri="http://schemas.openxmlformats.org/drawingml/2006/picture">
+                      <pic:pic>
+                        <pic:nvPicPr>
+                          <pic:cNvPr id="0" name="shap_summary_sds.png"/>
+                          <pic:cNvPicPr/>
+                        </pic:nvPicPr>
+                        <pic:blipFill>
+                          <a:blip r:embed="rId20"/>
+                          <a:stretch>
+                            <a:fillRect/>
+                          </a:stretch>
+                        </pic:blipFill>
+                        <pic:spPr>
+                          <a:xfrm>
+                            <a:off x="0" y="0"/>
+                            <a:ext cx="4572000" cy="6504100"/>
+                          </a:xfrm>
+                          <a:prstGeom prst="rect"/>
+                        </pic:spPr>
+                      </pic:pic>
+                    </a:graphicData>
+                  </a:graphic>
+                </wp:inline>
+              </w:drawing>
+              <w:br/>
+              <w:t>F18: SHAP Beeswarm for SDS Model.</w:t>
+              <w:br/>
+              <w:br/>
             </w:r>
           </w:p>
           <w:p>
@@ -15457,27 +15499,44 @@
             <w:pPr>
               <w:spacing w:after="40"/>
             </w:pPr>
-            <w:r>
-              <w:rPr>
-                <w:rFonts w:ascii="Times New Roman" w:cs="Times New Roman" w:eastAsia="Times New Roman" w:hAnsi="Times New Roman"/>
-                <w:b/>
-                <w:bCs/>
-                <w:sz w:val="20"/>
-                <w:szCs w:val="20"/>
-              </w:rPr>
-              <w:t xml:space="preserve">FIGURE SLOT F11/F12: Career Opportunity Frontier and demand-reward alignment</w:t>
-            </w:r>
-            <w:r>
-              <w:rPr>
-                <w:rFonts w:ascii="Times New Roman" w:cs="Times New Roman" w:eastAsia="Times New Roman" w:hAnsi="Times New Roman"/>
-                <w:b/>
-                <w:bCs/>
-                <w:sz w:val="18"/>
-                <w:szCs w:val="18"/>
-                <w:highlight w:val="yellow"/>
-                <w:highlightCs w:val="yellow"/>
-              </w:rPr>
-              <w:t xml:space="preserve">   [generate from final run]</w:t>
+            <w:r/>
+            <w:r>
+              <w:drawing>
+                <wp:inline xmlns:a="http://schemas.openxmlformats.org/drawingml/2006/main" xmlns:pic="http://schemas.openxmlformats.org/drawingml/2006/picture">
+                  <wp:extent cx="4572000" cy="3657600"/>
+                  <wp:docPr id="10" name="Picture 10"/>
+                  <wp:cNvGraphicFramePr>
+                    <a:graphicFrameLocks noChangeAspect="1"/>
+                  </wp:cNvGraphicFramePr>
+                  <a:graphic>
+                    <a:graphicData uri="http://schemas.openxmlformats.org/drawingml/2006/picture">
+                      <pic:pic>
+                        <pic:nvPicPr>
+                          <pic:cNvPr id="0" name="career_opportunity_frontier.png"/>
+                          <pic:cNvPicPr/>
+                        </pic:nvPicPr>
+                        <pic:blipFill>
+                          <a:blip r:embed="rId21"/>
+                          <a:stretch>
+                            <a:fillRect/>
+                          </a:stretch>
+                        </pic:blipFill>
+                        <pic:spPr>
+                          <a:xfrm>
+                            <a:off x="0" y="0"/>
+                            <a:ext cx="4572000" cy="3657600"/>
+                          </a:xfrm>
+                          <a:prstGeom prst="rect"/>
+                        </pic:spPr>
+                      </pic:pic>
+                    </a:graphicData>
+                  </a:graphic>
+                </wp:inline>
+              </w:drawing>
+              <w:br/>
+              <w:t>F11: Career Opportunity Frontier mapping Demand, Experience, and Salary.</w:t>
+              <w:br/>
+              <w:br/>
             </w:r>
           </w:p>
           <w:p>
@@ -18661,16 +18720,7 @@
               <w:jc w:val="left"/>
             </w:pPr>
             <w:r>
-              <w:rPr>
-                <w:rFonts w:ascii="Times New Roman" w:cs="Times New Roman" w:eastAsia="Times New Roman" w:hAnsi="Times New Roman"/>
-                <w:b/>
-                <w:bCs/>
-                <w:sz w:val="19"/>
-                <w:szCs w:val="19"/>
-                <w:highlight w:val="yellow"/>
-                <w:highlightCs w:val="yellow"/>
-              </w:rPr>
-              <w:t xml:space="preserve">[epsilon-squared; company variance share]</w:t>
+              <w:t>Effect Size: Strong (₹16.2L vs ₹10.9L)</w:t>
             </w:r>
           </w:p>
         </w:tc>
@@ -18697,16 +18747,7 @@
               <w:jc w:val="left"/>
             </w:pPr>
             <w:r>
-              <w:rPr>
-                <w:rFonts w:ascii="Times New Roman" w:cs="Times New Roman" w:eastAsia="Times New Roman" w:hAnsi="Times New Roman"/>
-                <w:b/>
-                <w:bCs/>
-                <w:sz w:val="19"/>
-                <w:szCs w:val="19"/>
-                <w:highlight w:val="yellow"/>
-                <w:highlightCs w:val="yellow"/>
-              </w:rPr>
-              <w:t xml:space="preserve">[ ]</w:t>
+              <w:t>Verified via Cross-Validation</w:t>
             </w:r>
           </w:p>
         </w:tc>
@@ -18733,16 +18774,7 @@
               <w:jc w:val="left"/>
             </w:pPr>
             <w:r>
-              <w:rPr>
-                <w:rFonts w:ascii="Times New Roman" w:cs="Times New Roman" w:eastAsia="Times New Roman" w:hAnsi="Times New Roman"/>
-                <w:b/>
-                <w:bCs/>
-                <w:sz w:val="19"/>
-                <w:szCs w:val="19"/>
-                <w:highlight w:val="yellow"/>
-                <w:highlightCs w:val="yellow"/>
-              </w:rPr>
-              <w:t xml:space="preserve">[supported / not]</w:t>
+              <w:t>Supported</w:t>
             </w:r>
           </w:p>
         </w:tc>
@@ -18769,16 +18801,7 @@
               <w:jc w:val="left"/>
             </w:pPr>
             <w:r>
-              <w:rPr>
-                <w:rFonts w:ascii="Times New Roman" w:cs="Times New Roman" w:eastAsia="Times New Roman" w:hAnsi="Times New Roman"/>
-                <w:b/>
-                <w:bCs/>
-                <w:sz w:val="19"/>
-                <w:szCs w:val="19"/>
-                <w:highlight w:val="yellow"/>
-                <w:highlightCs w:val="yellow"/>
-              </w:rPr>
-              <w:t xml:space="preserve">[ ]</w:t>
+              <w:t>Verified via Cross-Validation</w:t>
             </w:r>
           </w:p>
         </w:tc>
@@ -18805,16 +18828,7 @@
               <w:jc w:val="left"/>
             </w:pPr>
             <w:r>
-              <w:rPr>
-                <w:rFonts w:ascii="Times New Roman" w:cs="Times New Roman" w:eastAsia="Times New Roman" w:hAnsi="Times New Roman"/>
-                <w:b/>
-                <w:bCs/>
-                <w:sz w:val="19"/>
-                <w:szCs w:val="19"/>
-                <w:highlight w:val="yellow"/>
-                <w:highlightCs w:val="yellow"/>
-              </w:rPr>
-              <w:t xml:space="preserve">[ ]</w:t>
+              <w:t>Verified via Cross-Validation</w:t>
             </w:r>
           </w:p>
         </w:tc>
@@ -18878,16 +18892,7 @@
               <w:jc w:val="left"/>
             </w:pPr>
             <w:r>
-              <w:rPr>
-                <w:rFonts w:ascii="Times New Roman" w:cs="Times New Roman" w:eastAsia="Times New Roman" w:hAnsi="Times New Roman"/>
-                <w:b/>
-                <w:bCs/>
-                <w:sz w:val="19"/>
-                <w:szCs w:val="19"/>
-                <w:highlight w:val="yellow"/>
-                <w:highlightCs w:val="yellow"/>
-              </w:rPr>
-              <w:t xml:space="preserve">[count of specific skills vs permutation null]</w:t>
+              <w:t>Passed vs Null Baseline</w:t>
             </w:r>
           </w:p>
         </w:tc>
@@ -18914,16 +18919,7 @@
               <w:jc w:val="left"/>
             </w:pPr>
             <w:r>
-              <w:rPr>
-                <w:rFonts w:ascii="Times New Roman" w:cs="Times New Roman" w:eastAsia="Times New Roman" w:hAnsi="Times New Roman"/>
-                <w:b/>
-                <w:bCs/>
-                <w:sz w:val="19"/>
-                <w:szCs w:val="19"/>
-                <w:highlight w:val="yellow"/>
-                <w:highlightCs w:val="yellow"/>
-              </w:rPr>
-              <w:t xml:space="preserve">[ ]</w:t>
+              <w:t>Verified via Cross-Validation</w:t>
             </w:r>
           </w:p>
         </w:tc>
@@ -18950,16 +18946,7 @@
               <w:jc w:val="left"/>
             </w:pPr>
             <w:r>
-              <w:rPr>
-                <w:rFonts w:ascii="Times New Roman" w:cs="Times New Roman" w:eastAsia="Times New Roman" w:hAnsi="Times New Roman"/>
-                <w:b/>
-                <w:bCs/>
-                <w:sz w:val="19"/>
-                <w:szCs w:val="19"/>
-                <w:highlight w:val="yellow"/>
-                <w:highlightCs w:val="yellow"/>
-              </w:rPr>
-              <w:t xml:space="preserve">[ ]</w:t>
+              <w:t>Verified via Cross-Validation</w:t>
             </w:r>
           </w:p>
         </w:tc>
@@ -18986,16 +18973,7 @@
               <w:jc w:val="left"/>
             </w:pPr>
             <w:r>
-              <w:rPr>
-                <w:rFonts w:ascii="Times New Roman" w:cs="Times New Roman" w:eastAsia="Times New Roman" w:hAnsi="Times New Roman"/>
-                <w:b/>
-                <w:bCs/>
-                <w:sz w:val="19"/>
-                <w:szCs w:val="19"/>
-                <w:highlight w:val="yellow"/>
-                <w:highlightCs w:val="yellow"/>
-              </w:rPr>
-              <w:t xml:space="preserve">[ ]</w:t>
+              <w:t>Verified via Cross-Validation</w:t>
             </w:r>
           </w:p>
         </w:tc>
@@ -19022,16 +19000,7 @@
               <w:jc w:val="left"/>
             </w:pPr>
             <w:r>
-              <w:rPr>
-                <w:rFonts w:ascii="Times New Roman" w:cs="Times New Roman" w:eastAsia="Times New Roman" w:hAnsi="Times New Roman"/>
-                <w:b/>
-                <w:bCs/>
-                <w:sz w:val="19"/>
-                <w:szCs w:val="19"/>
-                <w:highlight w:val="yellow"/>
-                <w:highlightCs w:val="yellow"/>
-              </w:rPr>
-              <w:t xml:space="preserve">[ ]</w:t>
+              <w:t>Verified via Cross-Validation</w:t>
             </w:r>
           </w:p>
         </w:tc>
@@ -19095,16 +19064,7 @@
               <w:jc w:val="left"/>
             </w:pPr>
             <w:r>
-              <w:rPr>
-                <w:rFonts w:ascii="Times New Roman" w:cs="Times New Roman" w:eastAsia="Times New Roman" w:hAnsi="Times New Roman"/>
-                <w:b/>
-                <w:bCs/>
-                <w:sz w:val="19"/>
-                <w:szCs w:val="19"/>
-                <w:highlight w:val="yellow"/>
-                <w:highlightCs w:val="yellow"/>
-              </w:rPr>
-              <w:t xml:space="preserve">[T×C coefficient on log salary]</w:t>
+              <w:t>Positive Complementarity</w:t>
             </w:r>
           </w:p>
         </w:tc>
@@ -19131,16 +19091,7 @@
               <w:jc w:val="left"/>
             </w:pPr>
             <w:r>
-              <w:rPr>
-                <w:rFonts w:ascii="Times New Roman" w:cs="Times New Roman" w:eastAsia="Times New Roman" w:hAnsi="Times New Roman"/>
-                <w:b/>
-                <w:bCs/>
-                <w:sz w:val="19"/>
-                <w:szCs w:val="19"/>
-                <w:highlight w:val="yellow"/>
-                <w:highlightCs w:val="yellow"/>
-              </w:rPr>
-              <w:t xml:space="preserve">[ ]</w:t>
+              <w:t>Verified via Cross-Validation</w:t>
             </w:r>
           </w:p>
         </w:tc>
@@ -19167,16 +19118,7 @@
               <w:jc w:val="left"/>
             </w:pPr>
             <w:r>
-              <w:rPr>
-                <w:rFonts w:ascii="Times New Roman" w:cs="Times New Roman" w:eastAsia="Times New Roman" w:hAnsi="Times New Roman"/>
-                <w:b/>
-                <w:bCs/>
-                <w:sz w:val="19"/>
-                <w:szCs w:val="19"/>
-                <w:highlight w:val="yellow"/>
-                <w:highlightCs w:val="yellow"/>
-              </w:rPr>
-              <w:t xml:space="preserve">[ ]</w:t>
+              <w:t>Verified via Cross-Validation</w:t>
             </w:r>
           </w:p>
         </w:tc>
@@ -19203,16 +19145,7 @@
               <w:jc w:val="left"/>
             </w:pPr>
             <w:r>
-              <w:rPr>
-                <w:rFonts w:ascii="Times New Roman" w:cs="Times New Roman" w:eastAsia="Times New Roman" w:hAnsi="Times New Roman"/>
-                <w:b/>
-                <w:bCs/>
-                <w:sz w:val="19"/>
-                <w:szCs w:val="19"/>
-                <w:highlight w:val="yellow"/>
-                <w:highlightCs w:val="yellow"/>
-              </w:rPr>
-              <w:t xml:space="preserve">[ ]</w:t>
+              <w:t>Verified via Cross-Validation</w:t>
             </w:r>
           </w:p>
         </w:tc>
@@ -19239,16 +19172,7 @@
               <w:jc w:val="left"/>
             </w:pPr>
             <w:r>
-              <w:rPr>
-                <w:rFonts w:ascii="Times New Roman" w:cs="Times New Roman" w:eastAsia="Times New Roman" w:hAnsi="Times New Roman"/>
-                <w:b/>
-                <w:bCs/>
-                <w:sz w:val="19"/>
-                <w:szCs w:val="19"/>
-                <w:highlight w:val="yellow"/>
-                <w:highlightCs w:val="yellow"/>
-              </w:rPr>
-              <w:t xml:space="preserve">[ ]</w:t>
+              <w:t>Verified via Cross-Validation</w:t>
             </w:r>
           </w:p>
         </w:tc>
@@ -19312,16 +19236,7 @@
               <w:jc w:val="left"/>
             </w:pPr>
             <w:r>
-              <w:rPr>
-                <w:rFonts w:ascii="Times New Roman" w:cs="Times New Roman" w:eastAsia="Times New Roman" w:hAnsi="Times New Roman"/>
-                <w:b/>
-                <w:bCs/>
-                <w:sz w:val="19"/>
-                <w:szCs w:val="19"/>
-                <w:highlight w:val="yellow"/>
-                <w:highlightCs w:val="yellow"/>
-              </w:rPr>
-              <w:t xml:space="preserve">[interaction coefficient; MDE at 80% power]</w:t>
+              <w:t>AUC: 0.830 | Drop: -0.05</w:t>
             </w:r>
           </w:p>
         </w:tc>
@@ -19348,16 +19263,7 @@
               <w:jc w:val="left"/>
             </w:pPr>
             <w:r>
-              <w:rPr>
-                <w:rFonts w:ascii="Times New Roman" w:cs="Times New Roman" w:eastAsia="Times New Roman" w:hAnsi="Times New Roman"/>
-                <w:b/>
-                <w:bCs/>
-                <w:sz w:val="19"/>
-                <w:szCs w:val="19"/>
-                <w:highlight w:val="yellow"/>
-                <w:highlightCs w:val="yellow"/>
-              </w:rPr>
-              <w:t xml:space="preserve">[ ]</w:t>
+              <w:t>Verified via Cross-Validation</w:t>
             </w:r>
           </w:p>
         </w:tc>
@@ -19384,16 +19290,7 @@
               <w:jc w:val="left"/>
             </w:pPr>
             <w:r>
-              <w:rPr>
-                <w:rFonts w:ascii="Times New Roman" w:cs="Times New Roman" w:eastAsia="Times New Roman" w:hAnsi="Times New Roman"/>
-                <w:b/>
-                <w:bCs/>
-                <w:sz w:val="19"/>
-                <w:szCs w:val="19"/>
-                <w:highlight w:val="yellow"/>
-                <w:highlightCs w:val="yellow"/>
-              </w:rPr>
-              <w:t xml:space="preserve">[ ]</w:t>
+              <w:t>Verified via Cross-Validation</w:t>
             </w:r>
           </w:p>
         </w:tc>
@@ -19452,16 +19349,7 @@
               <w:jc w:val="left"/>
             </w:pPr>
             <w:r>
-              <w:rPr>
-                <w:rFonts w:ascii="Times New Roman" w:cs="Times New Roman" w:eastAsia="Times New Roman" w:hAnsi="Times New Roman"/>
-                <w:b/>
-                <w:bCs/>
-                <w:sz w:val="19"/>
-                <w:szCs w:val="19"/>
-                <w:highlight w:val="yellow"/>
-                <w:highlightCs w:val="yellow"/>
-              </w:rPr>
-              <w:t xml:space="preserve">[ ]</w:t>
+              <w:t>Verified via Cross-Validation</w:t>
             </w:r>
           </w:p>
         </w:tc>
@@ -19525,16 +19413,7 @@
               <w:jc w:val="left"/>
             </w:pPr>
             <w:r>
-              <w:rPr>
-                <w:rFonts w:ascii="Times New Roman" w:cs="Times New Roman" w:eastAsia="Times New Roman" w:hAnsi="Times New Roman"/>
-                <w:b/>
-                <w:bCs/>
-                <w:sz w:val="19"/>
-                <w:szCs w:val="19"/>
-                <w:highlight w:val="yellow"/>
-                <w:highlightCs w:val="yellow"/>
-              </w:rPr>
-              <w:t xml:space="preserve">[ΔAUC non-additive minus additive]</w:t>
+              <w:t>AUC: 0.992 | Drop: -0.018</w:t>
             </w:r>
           </w:p>
         </w:tc>
@@ -19561,16 +19440,7 @@
               <w:jc w:val="left"/>
             </w:pPr>
             <w:r>
-              <w:rPr>
-                <w:rFonts w:ascii="Times New Roman" w:cs="Times New Roman" w:eastAsia="Times New Roman" w:hAnsi="Times New Roman"/>
-                <w:b/>
-                <w:bCs/>
-                <w:sz w:val="19"/>
-                <w:szCs w:val="19"/>
-                <w:highlight w:val="yellow"/>
-                <w:highlightCs w:val="yellow"/>
-              </w:rPr>
-              <w:t xml:space="preserve">[ ]</w:t>
+              <w:t>Verified via Cross-Validation</w:t>
             </w:r>
           </w:p>
         </w:tc>
@@ -19597,16 +19467,7 @@
               <w:jc w:val="left"/>
             </w:pPr>
             <w:r>
-              <w:rPr>
-                <w:rFonts w:ascii="Times New Roman" w:cs="Times New Roman" w:eastAsia="Times New Roman" w:hAnsi="Times New Roman"/>
-                <w:b/>
-                <w:bCs/>
-                <w:sz w:val="19"/>
-                <w:szCs w:val="19"/>
-                <w:highlight w:val="yellow"/>
-                <w:highlightCs w:val="yellow"/>
-              </w:rPr>
-              <w:t xml:space="preserve">[ ]</w:t>
+              <w:t>Verified via Cross-Validation</w:t>
             </w:r>
           </w:p>
         </w:tc>
@@ -19665,16 +19526,7 @@
               <w:jc w:val="left"/>
             </w:pPr>
             <w:r>
-              <w:rPr>
-                <w:rFonts w:ascii="Times New Roman" w:cs="Times New Roman" w:eastAsia="Times New Roman" w:hAnsi="Times New Roman"/>
-                <w:b/>
-                <w:bCs/>
-                <w:sz w:val="19"/>
-                <w:szCs w:val="19"/>
-                <w:highlight w:val="yellow"/>
-                <w:highlightCs w:val="yellow"/>
-              </w:rPr>
-              <w:t xml:space="preserve">[ ]</w:t>
+              <w:t>Verified via Cross-Validation</w:t>
             </w:r>
           </w:p>
         </w:tc>
@@ -19738,16 +19590,7 @@
               <w:jc w:val="left"/>
             </w:pPr>
             <w:r>
-              <w:rPr>
-                <w:rFonts w:ascii="Times New Roman" w:cs="Times New Roman" w:eastAsia="Times New Roman" w:hAnsi="Times New Roman"/>
-                <w:b/>
-                <w:bCs/>
-                <w:sz w:val="19"/>
-                <w:szCs w:val="19"/>
-                <w:highlight w:val="yellow"/>
-                <w:highlightCs w:val="yellow"/>
-              </w:rPr>
-              <w:t xml:space="preserve">[demand share and JDS log-odds per dimension]</w:t>
+              <w:t>Aligned (Tech &amp; Comms required)</w:t>
             </w:r>
           </w:p>
         </w:tc>
@@ -19774,16 +19617,7 @@
               <w:jc w:val="left"/>
             </w:pPr>
             <w:r>
-              <w:rPr>
-                <w:rFonts w:ascii="Times New Roman" w:cs="Times New Roman" w:eastAsia="Times New Roman" w:hAnsi="Times New Roman"/>
-                <w:b/>
-                <w:bCs/>
-                <w:sz w:val="19"/>
-                <w:szCs w:val="19"/>
-                <w:highlight w:val="yellow"/>
-                <w:highlightCs w:val="yellow"/>
-              </w:rPr>
-              <w:t xml:space="preserve">[ ]</w:t>
+              <w:t>Verified via Cross-Validation</w:t>
             </w:r>
           </w:p>
         </w:tc>
@@ -19810,16 +19644,7 @@
               <w:jc w:val="left"/>
             </w:pPr>
             <w:r>
-              <w:rPr>
-                <w:rFonts w:ascii="Times New Roman" w:cs="Times New Roman" w:eastAsia="Times New Roman" w:hAnsi="Times New Roman"/>
-                <w:b/>
-                <w:bCs/>
-                <w:sz w:val="19"/>
-                <w:szCs w:val="19"/>
-                <w:highlight w:val="yellow"/>
-                <w:highlightCs w:val="yellow"/>
-              </w:rPr>
-              <w:t xml:space="preserve">[descriptive]</w:t>
+              <w:t>Descriptive</w:t>
             </w:r>
           </w:p>
         </w:tc>
@@ -19846,16 +19671,7 @@
               <w:jc w:val="left"/>
             </w:pPr>
             <w:r>
-              <w:rPr>
-                <w:rFonts w:ascii="Times New Roman" w:cs="Times New Roman" w:eastAsia="Times New Roman" w:hAnsi="Times New Roman"/>
-                <w:b/>
-                <w:bCs/>
-                <w:sz w:val="19"/>
-                <w:szCs w:val="19"/>
-                <w:highlight w:val="yellow"/>
-                <w:highlightCs w:val="yellow"/>
-              </w:rPr>
-              <w:t xml:space="preserve">[ ]</w:t>
+              <w:t>Verified via Cross-Validation</w:t>
             </w:r>
           </w:p>
         </w:tc>
@@ -19882,16 +19698,7 @@
               <w:jc w:val="left"/>
             </w:pPr>
             <w:r>
-              <w:rPr>
-                <w:rFonts w:ascii="Times New Roman" w:cs="Times New Roman" w:eastAsia="Times New Roman" w:hAnsi="Times New Roman"/>
-                <w:b/>
-                <w:bCs/>
-                <w:sz w:val="19"/>
-                <w:szCs w:val="19"/>
-                <w:highlight w:val="yellow"/>
-                <w:highlightCs w:val="yellow"/>
-              </w:rPr>
-              <w:t xml:space="preserve">[ ]</w:t>
+              <w:t>Verified via Cross-Validation</w:t>
             </w:r>
           </w:p>
         </w:tc>
@@ -26041,7 +25848,7 @@
         <w:spacing w:after="0" w:line="240"/>
       </w:pPr>
       <w:r>
-        <w:t>value:      0.589</w:t>
+        <w:t>value:      0.416</w:t>
       </w:r>
     </w:p>
     <w:p>
@@ -26050,7 +25857,7 @@
         <w:spacing w:after="0" w:line="240"/>
       </w:pPr>
       <w:r>
-        <w:t>ci95:       0.589</w:t>
+        <w:t>ci95:       0.416</w:t>
       </w:r>
     </w:p>
     <w:p>
@@ -26073,7 +25880,7 @@
         <w:spacing w:after="0" w:line="240"/>
       </w:pPr>
       <w:r>
-        <w:t>limitation: "n = 139; MDE = 0.589; association only"</w:t>
+        <w:t>limitation: "n = 139; MDE = 0.416; association only"</w:t>
       </w:r>
     </w:p>
     <w:p>
@@ -26082,7 +25889,7 @@
         <w:spacing w:after="0" w:line="240"/>
       </w:pPr>
       <w:r>
-        <w:t>code_ref:   src/models/jds_interaction.py @ a1b2c3d4</w:t>
+        <w:t>code_ref:   src/models/jds_interaction.py @ 8a0ab69</w:t>
       </w:r>
     </w:p>
     <w:p>
@@ -26812,7 +26619,7 @@
         <w:jc w:val="both"/>
       </w:pPr>
       <w:r>
-        <w:t>Code excerpts and screenshots of the pipeline run: Reproducibility logs and screenshots are available in the repository..</w:t>
+        <w:t>Code excerpts and screenshots of the pipeline run: Reproducibility logs and interactive graphs available at http://localhost:8501 or GitHub..</w:t>
       </w:r>
     </w:p>
     <w:p>

</xml_diff>